<commit_message>
refactor(themes): aurora-v3 becomes aurora; drop the old aurora and aurora-v2
Its interactions script, shared by seven themes, is now themes/aurora.js. Also fixes de_first in test_print, a name that only crashed when the assertion failed.
</commit_message>
<xml_diff>
--- a/templates/aurora.docx
+++ b/templates/aurora.docx
@@ -14,18 +14,18 @@
         <w:tblLook w:firstColumn="1" w:firstRow="1" w:lastColumn="0" w:lastRow="0" w:noHBand="0" w:noVBand="1" w:val="04A0"/>
       </w:tblPr>
       <w:tblGrid>
-        <w:gridCol w:w="7937"/>
-        <w:gridCol w:w="3969"/>
+        <w:gridCol w:w="8787"/>
+        <w:gridCol w:w="3118"/>
       </w:tblGrid>
       <w:tr>
         <w:trPr>
-          <w:trHeight w:val="2608" w:hRule="exact"/>
+          <w:trHeight w:val="1871" w:hRule="exact"/>
         </w:trPr>
         <w:tc>
           <w:tcPr>
-            <w:tcW w:type="dxa" w:w="7937"/>
+            <w:tcW w:type="dxa" w:w="8787"/>
             <w:tcMar>
-              <w:top w:w="708" w:type="dxa"/>
+              <w:top w:w="0" w:type="dxa"/>
               <w:left w:w="793" w:type="dxa"/>
               <w:bottom w:w="0" w:type="dxa"/>
               <w:right w:w="226" w:type="dxa"/>
@@ -51,10 +51,10 @@
         </w:tc>
         <w:tc>
           <w:tcPr>
-            <w:tcW w:type="dxa" w:w="3969"/>
+            <w:tcW w:type="dxa" w:w="3118"/>
             <w:tcMar>
-              <w:top w:w="538" w:type="dxa"/>
-              <w:left w:w="226" w:type="dxa"/>
+              <w:top w:w="0" w:type="dxa"/>
+              <w:left w:w="113" w:type="dxa"/>
               <w:bottom w:w="0" w:type="dxa"/>
               <w:right w:w="793" w:type="dxa"/>
             </w:tcMar>
@@ -72,7 +72,7 @@
       </w:tr>
       <w:tr>
         <w:trPr>
-          <w:trHeight w:val="1134" w:hRule="exact"/>
+          <w:trHeight w:val="1247" w:hRule="exact"/>
         </w:trPr>
         <w:tc>
           <w:tcPr>
@@ -121,7 +121,7 @@
           <w:tcPr>
             <w:tcW w:type="dxa" w:w="3175"/>
             <w:tcMar>
-              <w:top w:w="113" w:type="dxa"/>
+              <w:top w:w="453" w:type="dxa"/>
               <w:left w:w="793" w:type="dxa"/>
               <w:bottom w:w="0" w:type="dxa"/>
               <w:right w:w="340" w:type="dxa"/>
@@ -137,8 +137,8 @@
           <w:tcPr>
             <w:tcW w:type="dxa" w:w="8731"/>
             <w:tcMar>
-              <w:top w:w="368" w:type="dxa"/>
-              <w:left w:w="453" w:type="dxa"/>
+              <w:top w:w="453" w:type="dxa"/>
+              <w:left w:w="340" w:type="dxa"/>
               <w:bottom w:w="0" w:type="dxa"/>
               <w:right w:w="793" w:type="dxa"/>
             </w:tcMar>
@@ -156,7 +156,7 @@
       <w:headerReference w:type="first" r:id="rId9"/>
       <w:headerReference w:type="default" r:id="rId10"/>
       <w:pgSz w:w="11906" w:h="16838"/>
-      <w:pgMar w:top="0" w:right="0" w:bottom="454" w:left="0" w:header="0" w:footer="0" w:gutter="0"/>
+      <w:pgMar w:top="397" w:right="0" w:bottom="680" w:left="0" w:header="0" w:footer="0" w:gutter="0"/>
       <w:cols w:space="720"/>
       <w:titlePg/>
       <w:docGrid w:linePitch="360"/>
@@ -181,7 +181,7 @@
           <wp:positionV relativeFrom="page">
             <wp:posOffset>0</wp:posOffset>
           </wp:positionV>
-          <wp:extent cx="7560000" cy="2304000"/>
+          <wp:extent cx="7560000" cy="2232000"/>
           <wp:effectExtent l="0" t="0" r="0" b="0"/>
           <wp:wrapNone/>
           <wp:docPr id="1001" name="Shape 1001"/>
@@ -193,14 +193,22 @@
                 <wps:spPr>
                   <a:xfrm>
                     <a:off x="0" y="0"/>
-                    <a:ext cx="7560000" cy="2304000"/>
+                    <a:ext cx="7560000" cy="2232000"/>
                   </a:xfrm>
                   <a:prstGeom prst="rect">
                     <a:avLst/>
                   </a:prstGeom>
-                  <a:solidFill>
-                    <a:srgbClr val="0B1024"/>
-                  </a:solidFill>
+                  <a:gradFill rotWithShape="1">
+                    <a:gsLst>
+                      <a:gs pos="0">
+                        <a:srgbClr val="0B1024"/>
+                      </a:gs>
+                      <a:gs pos="100000">
+                        <a:srgbClr val="1A2250"/>
+                      </a:gs>
+                    </a:gsLst>
+                    <a:lin ang="2700000" scaled="0"/>
+                  </a:gradFill>
                   <a:ln>
                     <a:noFill/>
                   </a:ln>
@@ -217,12 +225,12 @@
         <wp:anchor distT="0" distB="0" distL="0" distR="0" simplePos="0" relativeHeight="1002" behindDoc="1" locked="1" layoutInCell="0" allowOverlap="1">
           <wp:simplePos x="0" y="0"/>
           <wp:positionH relativeFrom="page">
-            <wp:posOffset>0</wp:posOffset>
+            <wp:posOffset>504000</wp:posOffset>
           </wp:positionH>
           <wp:positionV relativeFrom="page">
-            <wp:posOffset>2246400</wp:posOffset>
+            <wp:posOffset>1512000</wp:posOffset>
           </wp:positionV>
-          <wp:extent cx="5040000" cy="57600"/>
+          <wp:extent cx="6552000" cy="576000"/>
           <wp:effectExtent l="0" t="0" r="0" b="0"/>
           <wp:wrapNone/>
           <wp:docPr id="1002" name="Shape 1002"/>
@@ -234,54 +242,13 @@
                 <wps:spPr>
                   <a:xfrm>
                     <a:off x="0" y="0"/>
-                    <a:ext cx="5040000" cy="57600"/>
+                    <a:ext cx="6552000" cy="576000"/>
                   </a:xfrm>
                   <a:prstGeom prst="rect">
                     <a:avLst/>
                   </a:prstGeom>
                   <a:solidFill>
-                    <a:srgbClr val="7C5CFF"/>
-                  </a:solidFill>
-                  <a:ln>
-                    <a:noFill/>
-                  </a:ln>
-                </wps:spPr>
-                <wps:bodyPr/>
-              </wps:wsp>
-            </a:graphicData>
-          </a:graphic>
-        </wp:anchor>
-      </w:drawing>
-    </w:r>
-    <w:r xmlns:a="http://schemas.openxmlformats.org/drawingml/2006/main">
-      <w:drawing>
-        <wp:anchor distT="0" distB="0" distL="0" distR="0" simplePos="0" relativeHeight="1003" behindDoc="1" locked="1" layoutInCell="0" allowOverlap="1">
-          <wp:simplePos x="0" y="0"/>
-          <wp:positionH relativeFrom="page">
-            <wp:posOffset>5040000</wp:posOffset>
-          </wp:positionH>
-          <wp:positionV relativeFrom="page">
-            <wp:posOffset>2246400</wp:posOffset>
-          </wp:positionV>
-          <wp:extent cx="2520000" cy="57600"/>
-          <wp:effectExtent l="0" t="0" r="0" b="0"/>
-          <wp:wrapNone/>
-          <wp:docPr id="1003" name="Shape 1003"/>
-          <wp:cNvGraphicFramePr/>
-          <a:graphic>
-            <a:graphicData uri="http://schemas.microsoft.com/office/word/2010/wordprocessingShape">
-              <wps:wsp>
-                <wps:cNvSpPr/>
-                <wps:spPr>
-                  <a:xfrm>
-                    <a:off x="0" y="0"/>
-                    <a:ext cx="2520000" cy="57600"/>
-                  </a:xfrm>
-                  <a:prstGeom prst="rect">
-                    <a:avLst/>
-                  </a:prstGeom>
-                  <a:solidFill>
-                    <a:srgbClr val="19C3B1"/>
+                    <a:srgbClr val="10173A"/>
                   </a:solidFill>
                   <a:ln>
                     <a:noFill/>
@@ -303,90 +270,8 @@
   <w:p>
     <w:pPr>
       <w:pStyle w:val="CVPhoto"/>
-      <w:spacing w:before="312"/>
-    </w:pPr>
-    <w:r xmlns:a="http://schemas.openxmlformats.org/drawingml/2006/main">
-      <w:drawing>
-        <wp:anchor distT="0" distB="0" distL="0" distR="0" simplePos="0" relativeHeight="1101" behindDoc="1" locked="1" layoutInCell="0" allowOverlap="1">
-          <wp:simplePos x="0" y="0"/>
-          <wp:positionH relativeFrom="page">
-            <wp:posOffset>0</wp:posOffset>
-          </wp:positionH>
-          <wp:positionV relativeFrom="page">
-            <wp:posOffset>0</wp:posOffset>
-          </wp:positionV>
-          <wp:extent cx="5040000" cy="72000"/>
-          <wp:effectExtent l="0" t="0" r="0" b="0"/>
-          <wp:wrapNone/>
-          <wp:docPr id="1101" name="Shape 1101"/>
-          <wp:cNvGraphicFramePr/>
-          <a:graphic>
-            <a:graphicData uri="http://schemas.microsoft.com/office/word/2010/wordprocessingShape">
-              <wps:wsp>
-                <wps:cNvSpPr/>
-                <wps:spPr>
-                  <a:xfrm>
-                    <a:off x="0" y="0"/>
-                    <a:ext cx="5040000" cy="72000"/>
-                  </a:xfrm>
-                  <a:prstGeom prst="rect">
-                    <a:avLst/>
-                  </a:prstGeom>
-                  <a:solidFill>
-                    <a:srgbClr val="7C5CFF"/>
-                  </a:solidFill>
-                  <a:ln>
-                    <a:noFill/>
-                  </a:ln>
-                </wps:spPr>
-                <wps:bodyPr/>
-              </wps:wsp>
-            </a:graphicData>
-          </a:graphic>
-        </wp:anchor>
-      </w:drawing>
-    </w:r>
-    <w:r xmlns:a="http://schemas.openxmlformats.org/drawingml/2006/main">
-      <w:drawing>
-        <wp:anchor distT="0" distB="0" distL="0" distR="0" simplePos="0" relativeHeight="1102" behindDoc="1" locked="1" layoutInCell="0" allowOverlap="1">
-          <wp:simplePos x="0" y="0"/>
-          <wp:positionH relativeFrom="page">
-            <wp:posOffset>5040000</wp:posOffset>
-          </wp:positionH>
-          <wp:positionV relativeFrom="page">
-            <wp:posOffset>0</wp:posOffset>
-          </wp:positionV>
-          <wp:extent cx="2520000" cy="72000"/>
-          <wp:effectExtent l="0" t="0" r="0" b="0"/>
-          <wp:wrapNone/>
-          <wp:docPr id="1102" name="Shape 1102"/>
-          <wp:cNvGraphicFramePr/>
-          <a:graphic>
-            <a:graphicData uri="http://schemas.microsoft.com/office/word/2010/wordprocessingShape">
-              <wps:wsp>
-                <wps:cNvSpPr/>
-                <wps:spPr>
-                  <a:xfrm>
-                    <a:off x="0" y="0"/>
-                    <a:ext cx="2520000" cy="72000"/>
-                  </a:xfrm>
-                  <a:prstGeom prst="rect">
-                    <a:avLst/>
-                  </a:prstGeom>
-                  <a:solidFill>
-                    <a:srgbClr val="19C3B1"/>
-                  </a:solidFill>
-                  <a:ln>
-                    <a:noFill/>
-                  </a:ln>
-                </wps:spPr>
-                <wps:bodyPr/>
-              </wps:wsp>
-            </a:graphicData>
-          </a:graphic>
-        </wp:anchor>
-      </w:drawing>
-    </w:r>
+      <w:spacing w:before="397"/>
+    </w:pPr>
   </w:p>
 </w:hdr>
 </file>
@@ -410,22 +295,6 @@
     </w:lvl>
   </w:abstractNum>
   <w:abstractNum w:abstractNumId="91">
-    <w:lvl w:ilvl="0">
-      <w:start w:val="1"/>
-      <w:numFmt w:val="bullet"/>
-      <w:lvlText w:val="●"/>
-      <w:lvlJc w:val="left"/>
-      <w:pPr>
-        <w:ind w:left="300" w:hanging="300"/>
-      </w:pPr>
-      <w:rPr>
-        <w:rFonts w:ascii="Segoe UI Symbol" w:hAnsi="Segoe UI Symbol"/>
-        <w:color w:val="7C5CFF"/>
-        <w:sz w:val="14"/>
-      </w:rPr>
-    </w:lvl>
-  </w:abstractNum>
-  <w:abstractNum w:abstractNumId="92">
     <w:lvl w:ilvl="0">
       <w:start w:val="1"/>
       <w:numFmt w:val="bullet"/>
@@ -644,9 +513,6 @@
   </w:num>
   <w:num w:numId="91">
     <w:abstractNumId w:val="91"/>
-  </w:num>
-  <w:num w:numId="92">
-    <w:abstractNumId w:val="92"/>
   </w:num>
 </w:numbering>
 </file>
@@ -813,7 +679,7 @@
     <w:rsid w:val="00FC693F"/>
     <w:pPr>
       <w:keepNext w:val="0"/>
-      <w:spacing w:before="0" w:after="140" w:line="307" w:lineRule="auto"/>
+      <w:spacing w:before="0" w:after="80" w:line="298" w:lineRule="auto"/>
     </w:pPr>
     <w:rPr>
       <w:rFonts w:ascii="Inter" w:hAnsi="Inter" w:eastAsia="Inter"/>
@@ -821,7 +687,7 @@
       <w:i w:val="0"/>
       <w:caps w:val="0"/>
       <w:color w:val="151A2D"/>
-      <w:sz w:val="19"/>
+      <w:sz w:val="18"/>
     </w:rPr>
   </w:style>
   <w:style w:type="paragraph" w:styleId="Header">
@@ -879,10 +745,7 @@
     <w:pPr>
       <w:keepNext/>
       <w:keepLines/>
-      <w:numPr>
-        <w:numId w:val="91"/>
-      </w:numPr>
-      <w:spacing w:before="0" w:after="200" w:line="234" w:lineRule="auto"/>
+      <w:spacing w:before="0" w:after="160" w:line="234" w:lineRule="auto"/>
       <w:outlineLvl w:val="0"/>
     </w:pPr>
     <w:rPr>
@@ -892,7 +755,6 @@
       <w:color w:val="151A2D"/>
       <w:sz w:val="28"/>
       <w:szCs w:val="28"/>
-      <w:spacing w:val="-2"/>
     </w:rPr>
   </w:style>
   <w:style w:type="paragraph" w:styleId="Heading2">
@@ -907,15 +769,15 @@
     <w:pPr>
       <w:keepNext/>
       <w:keepLines/>
-      <w:spacing w:before="80" w:after="0" w:line="258" w:lineRule="auto"/>
+      <w:spacing w:before="80" w:after="0" w:line="253" w:lineRule="auto"/>
       <w:outlineLvl w:val="1"/>
     </w:pPr>
     <w:rPr>
-      <w:rFonts w:ascii="Inter Bold" w:hAnsi="Inter Bold" w:eastAsia="Inter Bold" w:cs="Inter Bold"/>
+      <w:rFonts w:ascii="Fraunces Bold" w:hAnsi="Fraunces Bold" w:eastAsia="Fraunces Bold" w:cs="Fraunces Bold"/>
       <w:i w:val="0"/>
       <w:caps w:val="0"/>
       <w:color w:val="151A2D"/>
-      <w:sz w:val="21"/>
+      <w:sz w:val="22"/>
       <w:szCs w:val="26"/>
     </w:rPr>
   </w:style>
@@ -931,7 +793,7 @@
     <w:pPr>
       <w:keepNext/>
       <w:keepLines/>
-      <w:spacing w:before="0" w:after="160" w:line="238" w:lineRule="auto"/>
+      <w:spacing w:before="0" w:after="120" w:line="238" w:lineRule="auto"/>
       <w:outlineLvl w:val="2"/>
     </w:pPr>
     <w:rPr>
@@ -940,7 +802,7 @@
       <w:caps/>
       <w:color w:val="667085"/>
       <w:sz w:val="13"/>
-      <w:spacing w:val="20"/>
+      <w:spacing w:val="18"/>
     </w:rPr>
   </w:style>
   <w:style w:type="paragraph" w:styleId="Heading4">
@@ -956,7 +818,7 @@
     <w:pPr>
       <w:keepNext/>
       <w:keepLines/>
-      <w:spacing w:before="120" w:after="20" w:line="238" w:lineRule="auto"/>
+      <w:spacing w:before="120" w:after="0" w:line="298" w:lineRule="auto"/>
       <w:outlineLvl w:val="3"/>
     </w:pPr>
     <w:rPr>
@@ -1249,10 +1111,7 @@
     <w:rsid w:val="00FC693F"/>
     <w:pPr>
       <w:keepNext w:val="0"/>
-      <w:pBdr>
-        <w:left w:val="single" w:sz="6" w:space="8" w:color="E4E7EF"/>
-      </w:pBdr>
-      <w:spacing w:before="0" w:after="40" w:line="307" w:lineRule="auto"/>
+      <w:spacing w:before="0" w:after="80" w:line="298" w:lineRule="auto"/>
       <w:ind w:left="340"/>
       <w:contextualSpacing/>
     </w:pPr>
@@ -1262,7 +1121,7 @@
       <w:i w:val="0"/>
       <w:caps w:val="0"/>
       <w:color w:val="151A2D"/>
-      <w:sz w:val="19"/>
+      <w:sz w:val="18"/>
     </w:rPr>
   </w:style>
   <w:style w:type="paragraph" w:styleId="BodyText">
@@ -12529,7 +12388,7 @@
     <w:basedOn w:val="Normal"/>
     <w:pPr>
       <w:keepNext w:val="0"/>
-      <w:spacing w:before="0" w:after="0" w:line="204" w:lineRule="auto"/>
+      <w:spacing w:before="0" w:after="0" w:line="195" w:lineRule="auto"/>
     </w:pPr>
     <w:rPr>
       <w:rFonts w:ascii="Fraunces Bold" w:hAnsi="Fraunces Bold" w:eastAsia="Fraunces Bold" w:cs="Fraunces Bold"/>
@@ -12545,16 +12404,15 @@
     <w:basedOn w:val="Normal"/>
     <w:pPr>
       <w:keepNext w:val="0"/>
-      <w:spacing w:before="0" w:after="80" w:line="258" w:lineRule="auto"/>
+      <w:spacing w:before="0" w:after="60" w:line="278" w:lineRule="auto"/>
     </w:pPr>
     <w:rPr>
-      <w:rFonts w:ascii="Inter" w:hAnsi="Inter" w:eastAsia="Inter"/>
-      <w:b w:val="0"/>
+      <w:rFonts w:ascii="Inter Bold" w:hAnsi="Inter Bold" w:eastAsia="Inter Bold" w:cs="Inter Bold"/>
       <w:i w:val="0"/>
       <w:caps/>
       <w:color w:val="A5B4FC"/>
-      <w:sz w:val="15"/>
-      <w:spacing w:val="24"/>
+      <w:sz w:val="14"/>
+      <w:spacing w:val="22"/>
     </w:rPr>
   </w:style>
   <w:style w:type="paragraph" w:customStyle="1" w:styleId="CVPhoto">
@@ -12579,18 +12437,18 @@
     <w:pPr>
       <w:keepNext/>
       <w:pBdr>
-        <w:top w:val="single" w:sz="6" w:space="5" w:color="343C63"/>
-        <w:bottom w:val="single" w:sz="6" w:space="5" w:color="343C63"/>
-        <w:between w:val="single" w:sz="6" w:space="5" w:color="343C63"/>
+        <w:top w:val="single" w:sz="6" w:space="5" w:color="3A4163"/>
+        <w:bottom w:val="single" w:sz="6" w:space="5" w:color="3A4163"/>
+        <w:between w:val="single" w:sz="6" w:space="5" w:color="3A4163"/>
       </w:pBdr>
-      <w:spacing w:before="0" w:after="0" w:line="258" w:lineRule="auto"/>
+      <w:spacing w:before="0" w:after="0" w:line="278" w:lineRule="auto"/>
       <w:jc w:val="right"/>
     </w:pPr>
     <w:rPr>
       <w:rFonts w:ascii="Inter Bold" w:hAnsi="Inter Bold" w:eastAsia="Inter Bold" w:cs="Inter Bold"/>
       <w:i w:val="0"/>
       <w:caps w:val="0"/>
-      <w:color w:val="E0E7FF"/>
+      <w:color w:val="FFFFFF"/>
       <w:sz w:val="16"/>
     </w:rPr>
   </w:style>
@@ -12599,7 +12457,7 @@
     <w:basedOn w:val="Normal"/>
     <w:pPr>
       <w:keepNext w:val="0"/>
-      <w:spacing w:before="0" w:after="0" w:line="307" w:lineRule="auto"/>
+      <w:spacing w:before="0" w:after="0" w:line="298" w:lineRule="auto"/>
     </w:pPr>
     <w:rPr>
       <w:rFonts w:ascii="Inter" w:hAnsi="Inter" w:eastAsia="Inter"/>
@@ -12622,7 +12480,7 @@
       <w:i w:val="0"/>
       <w:caps w:val="0"/>
       <w:color w:val="FFFFFF"/>
-      <w:sz w:val="36"/>
+      <w:sz w:val="34"/>
     </w:rPr>
   </w:style>
   <w:style w:type="paragraph" w:customStyle="1" w:styleId="CVHighlightLabel">
@@ -12630,7 +12488,7 @@
     <w:basedOn w:val="Normal"/>
     <w:pPr>
       <w:keepNext w:val="0"/>
-      <w:spacing w:before="0" w:after="0" w:line="258" w:lineRule="auto"/>
+      <w:spacing w:before="0" w:after="0" w:line="298" w:lineRule="auto"/>
     </w:pPr>
     <w:rPr>
       <w:rFonts w:ascii="Inter" w:hAnsi="Inter" w:eastAsia="Inter"/>
@@ -12647,16 +12505,16 @@
     <w:pPr>
       <w:keepNext/>
       <w:numPr>
-        <w:numId w:val="92"/>
+        <w:numId w:val="91"/>
       </w:numPr>
-      <w:spacing w:before="160" w:after="0" w:line="258" w:lineRule="auto"/>
+      <w:spacing w:before="120" w:after="0" w:line="253" w:lineRule="auto"/>
     </w:pPr>
     <w:rPr>
-      <w:rFonts w:ascii="Inter Bold" w:hAnsi="Inter Bold" w:eastAsia="Inter Bold" w:cs="Inter Bold"/>
+      <w:rFonts w:ascii="Fraunces Bold" w:hAnsi="Fraunces Bold" w:eastAsia="Fraunces Bold" w:cs="Fraunces Bold"/>
       <w:i w:val="0"/>
       <w:caps w:val="0"/>
       <w:color w:val="151A2D"/>
-      <w:sz w:val="21"/>
+      <w:sz w:val="20"/>
     </w:rPr>
   </w:style>
   <w:style w:type="paragraph" w:customStyle="1" w:styleId="CVCompany">
@@ -12664,10 +12522,7 @@
     <w:basedOn w:val="Normal"/>
     <w:pPr>
       <w:keepNext/>
-      <w:pBdr>
-        <w:left w:val="single" w:sz="6" w:space="8" w:color="E4E7EF"/>
-      </w:pBdr>
-      <w:spacing w:before="0" w:after="20" w:line="258" w:lineRule="auto"/>
+      <w:spacing w:before="0" w:after="20" w:line="298" w:lineRule="auto"/>
       <w:ind w:left="340"/>
     </w:pPr>
     <w:rPr>
@@ -12675,8 +12530,8 @@
       <w:b w:val="0"/>
       <w:i w:val="0"/>
       <w:caps w:val="0"/>
-      <w:color w:val="667085"/>
-      <w:sz w:val="16"/>
+      <w:color w:val="344054"/>
+      <w:sz w:val="18"/>
     </w:rPr>
   </w:style>
   <w:style w:type="paragraph" w:customStyle="1" w:styleId="Date">
@@ -12684,7 +12539,7 @@
     <w:basedOn w:val="Normal"/>
     <w:pPr>
       <w:keepNext/>
-      <w:spacing w:before="0" w:after="120" w:line="258" w:lineRule="auto"/>
+      <w:spacing w:before="20" w:after="100" w:line="258" w:lineRule="auto"/>
     </w:pPr>
     <w:rPr>
       <w:rFonts w:ascii="Inter Bold" w:hAnsi="Inter Bold" w:eastAsia="Inter Bold" w:cs="Inter Bold"/>
@@ -12692,7 +12547,7 @@
       <w:caps/>
       <w:color w:val="667085"/>
       <w:sz w:val="14"/>
-      <w:spacing w:val="6"/>
+      <w:spacing w:val="10"/>
     </w:rPr>
   </w:style>
   <w:style w:type="paragraph" w:customStyle="1" w:styleId="CVRoleDate">
@@ -12700,10 +12555,7 @@
     <w:basedOn w:val="Date"/>
     <w:pPr>
       <w:keepNext/>
-      <w:pBdr>
-        <w:left w:val="single" w:sz="6" w:space="8" w:color="E4E7EF"/>
-      </w:pBdr>
-      <w:spacing w:before="0" w:after="120" w:line="258" w:lineRule="auto"/>
+      <w:spacing w:before="20" w:after="100" w:line="258" w:lineRule="auto"/>
       <w:ind w:left="340"/>
     </w:pPr>
     <w:rPr>
@@ -12712,7 +12564,7 @@
       <w:caps/>
       <w:color w:val="667085"/>
       <w:sz w:val="14"/>
-      <w:spacing w:val="6"/>
+      <w:spacing w:val="10"/>
     </w:rPr>
   </w:style>
   <w:style w:type="paragraph" w:customStyle="1" w:styleId="SidebarText">
@@ -12720,7 +12572,7 @@
     <w:basedOn w:val="Normal"/>
     <w:pPr>
       <w:keepNext w:val="0"/>
-      <w:spacing w:before="0" w:after="20" w:line="307" w:lineRule="auto"/>
+      <w:spacing w:before="0" w:after="20" w:line="298" w:lineRule="auto"/>
     </w:pPr>
     <w:rPr>
       <w:rFonts w:ascii="Inter" w:hAnsi="Inter" w:eastAsia="Inter"/>
@@ -12739,7 +12591,7 @@
       <w:tabs>
         <w:tab w:pos="2041" w:val="right"/>
       </w:tabs>
-      <w:spacing w:before="0" w:after="80" w:line="307" w:lineRule="auto"/>
+      <w:spacing w:before="0" w:after="80" w:line="298" w:lineRule="auto"/>
     </w:pPr>
     <w:rPr>
       <w:rFonts w:ascii="Inter" w:hAnsi="Inter" w:eastAsia="Inter"/>
@@ -12755,7 +12607,7 @@
     <w:basedOn w:val="Normal"/>
     <w:pPr>
       <w:keepNext w:val="0"/>
-      <w:spacing w:before="0" w:after="20" w:line="307" w:lineRule="auto"/>
+      <w:spacing w:before="0" w:after="20" w:line="298" w:lineRule="auto"/>
     </w:pPr>
     <w:rPr>
       <w:rFonts w:ascii="Inter" w:hAnsi="Inter" w:eastAsia="Inter"/>
@@ -12771,7 +12623,7 @@
     <w:basedOn w:val="Normal"/>
     <w:pPr>
       <w:keepNext w:val="0"/>
-      <w:spacing w:before="0" w:after="80" w:line="198" w:lineRule="auto"/>
+      <w:spacing w:before="0" w:after="120" w:line="198" w:lineRule="auto"/>
     </w:pPr>
     <w:rPr>
       <w:rFonts w:ascii="Inter" w:hAnsi="Inter" w:eastAsia="Inter"/>
@@ -12787,10 +12639,7 @@
     <w:basedOn w:val="Normal"/>
     <w:pPr>
       <w:keepNext w:val="0"/>
-      <w:pBdr>
-        <w:left w:val="single" w:sz="6" w:space="8" w:color="E4E7EF"/>
-      </w:pBdr>
-      <w:spacing w:before="0" w:after="200" w:line="357" w:lineRule="auto"/>
+      <w:spacing w:before="0" w:after="200" w:line="377" w:lineRule="auto"/>
       <w:ind w:left="340"/>
     </w:pPr>
     <w:rPr>
@@ -12808,9 +12657,9 @@
     <w:pPr>
       <w:keepNext w:val="0"/>
       <w:pBdr>
-        <w:left w:val="single" w:sz="18" w:space="8" w:color="7C5CFF"/>
+        <w:left w:val="single" w:sz="18" w:space="8" w:color="A5B4FC"/>
       </w:pBdr>
-      <w:spacing w:before="0" w:after="80" w:line="307" w:lineRule="auto"/>
+      <w:spacing w:before="0" w:after="80" w:line="298" w:lineRule="auto"/>
       <w:ind w:left="227"/>
     </w:pPr>
     <w:rPr>
@@ -12818,8 +12667,8 @@
       <w:b w:val="0"/>
       <w:i/>
       <w:caps w:val="0"/>
-      <w:color w:val="3A3A3A"/>
-      <w:sz w:val="19"/>
+      <w:color w:val="374151"/>
+      <w:sz w:val="18"/>
     </w:rPr>
   </w:style>
   <w:style w:type="paragraph" w:customStyle="1" w:styleId="SidebarSectionsSpacing">
@@ -12827,23 +12676,7 @@
     <w:basedOn w:val="Normal"/>
     <w:pPr>
       <w:keepNext w:val="0"/>
-      <w:spacing w:before="0" w:after="180" w:line="307" w:lineRule="auto"/>
-    </w:pPr>
-    <w:rPr>
-      <w:rFonts w:ascii="Inter" w:hAnsi="Inter" w:eastAsia="Inter"/>
-      <w:b w:val="0"/>
-      <w:i w:val="0"/>
-      <w:caps w:val="0"/>
-      <w:color w:val="151A2D"/>
-      <w:sz w:val="4"/>
-    </w:rPr>
-  </w:style>
-  <w:style w:type="paragraph" w:customStyle="1" w:styleId="MainSectionsSpacing">
-    <w:name w:val="Main Sections Spacing"/>
-    <w:basedOn w:val="Normal"/>
-    <w:pPr>
-      <w:keepNext w:val="0"/>
-      <w:spacing w:before="0" w:after="240" w:line="307" w:lineRule="auto"/>
+      <w:spacing w:before="0" w:after="160" w:line="298" w:lineRule="auto"/>
     </w:pPr>
     <w:rPr>
       <w:rFonts w:ascii="Inter" w:hAnsi="Inter" w:eastAsia="Inter"/>
@@ -12854,6 +12687,22 @@
       <w:sz w:val="8"/>
     </w:rPr>
   </w:style>
+  <w:style w:type="paragraph" w:customStyle="1" w:styleId="MainSectionsSpacing">
+    <w:name w:val="Main Sections Spacing"/>
+    <w:basedOn w:val="Normal"/>
+    <w:pPr>
+      <w:keepNext w:val="0"/>
+      <w:spacing w:before="0" w:after="320" w:line="298" w:lineRule="auto"/>
+    </w:pPr>
+    <w:rPr>
+      <w:rFonts w:ascii="Inter" w:hAnsi="Inter" w:eastAsia="Inter"/>
+      <w:b w:val="0"/>
+      <w:i w:val="0"/>
+      <w:caps w:val="0"/>
+      <w:color w:val="151A2D"/>
+      <w:sz w:val="8"/>
+    </w:rPr>
+  </w:style>
   <w:style w:type="character" w:customStyle="1" w:styleId="CVAccent">
     <w:name w:val="CV Accent"/>
     <w:rPr>
@@ -12873,6 +12722,7 @@
     <w:name w:val="CV Tool"/>
     <w:rPr>
       <w:rFonts w:ascii="Inter" w:hAnsi="Inter"/>
+      <w:color w:val="3730A3"/>
       <w:sz w:val="14"/>
       <w:shd w:val="clear" w:color="auto" w:fill="EEF2FF"/>
     </w:rPr>
@@ -12882,7 +12732,7 @@
     <w:rPr>
       <w:rFonts w:ascii="Inter" w:hAnsi="Inter"/>
       <w:sz w:val="14"/>
-      <w:shd w:val="clear" w:color="auto" w:fill="7C5CFF"/>
+      <w:shd w:val="clear" w:color="auto" w:fill="EEF2FF"/>
     </w:rPr>
   </w:style>
   <w:style w:type="character" w:customStyle="1" w:styleId="CVSkillFill">

</xml_diff>